<commit_message>
feat: give the action-plan activity a reusable resource (instructions + example + template)
- Materials can now carry `downloads` (schema + build-time file check), surfaced
  as a "Resource for this activity" callout inside the block on the unit page and
  a "Resources to download" section on the material page.
- New editable Action Plan resource (agency-in-learning-action-plan.docx): how-to
  instructions, a worked example, and a blank template a learner can reuse for any
  goal; attached to cb-ail-making-an-action-plan.
- Incorporated into the student workbook: the "My action plan" page is now a
  proper template (goal, ordered steps with "what I need", first step) and points
  to the reusable sheet.

Co-Authored-By: Claude Opus 4.8 <noreply@anthropic.com>
</commit_message>
<xml_diff>
--- a/public/downloads/agency-in-learning-student-workbook.docx
+++ b/public/downloads/agency-in-learning-student-workbook.docx
@@ -1499,7 +1499,45 @@
           <w:sz w:val="22"/>
           <w:szCs w:val="22"/>
         </w:rPr>
-        <w:t xml:space="preserve">Draw the steps to reach your goal, in order.</w:t>
+        <w:t xml:space="preserve">Draw or write the steps to reach your goal, in order. For each step, what do you need?</w:t>
+      </w:r>
+    </w:p>
+    <w:p>
+      <w:pPr>
+        <w:spacing w:after="120" w:before="80"/>
+      </w:pPr>
+      <w:r>
+        <w:rPr>
+          <w:b/>
+          <w:bCs/>
+          <w:color w:val="041E42"/>
+          <w:sz w:val="22"/>
+          <w:szCs w:val="22"/>
+        </w:rPr>
+        <w:t xml:space="preserve">My goal: </w:t>
+      </w:r>
+      <w:r>
+        <w:rPr>
+          <w:color w:val="97999B"/>
+          <w:sz w:val="22"/>
+          <w:szCs w:val="22"/>
+        </w:rPr>
+        <w:t xml:space="preserve">________________________________________</w:t>
+      </w:r>
+    </w:p>
+    <w:p>
+      <w:pPr>
+        <w:spacing w:after="10" w:before="120"/>
+      </w:pPr>
+      <w:r>
+        <w:rPr>
+          <w:b/>
+          <w:bCs/>
+          <w:color w:val="004976"/>
+          <w:sz w:val="20"/>
+          <w:szCs w:val="20"/>
+        </w:rPr>
+        <w:t xml:space="preserve">Step 1 (first)</w:t>
       </w:r>
     </w:p>
     <w:tbl>
@@ -1519,7 +1557,7 @@
       </w:tblGrid>
       <w:tr>
         <w:trPr>
-          <w:trHeight w:val="1100" w:hRule="atLeast"/>
+          <w:trHeight w:val="620" w:hRule="atLeast"/>
         </w:trPr>
         <w:tc>
           <w:tcPr>
@@ -1539,12 +1577,50 @@
                 <w:sz w:val="18"/>
                 <w:szCs w:val="18"/>
               </w:rPr>
-              <w:t xml:space="preserve">step 1 — first</w:t>
+              <w:t xml:space="preserve">draw or write this step</w:t>
             </w:r>
           </w:p>
         </w:tc>
       </w:tr>
     </w:tbl>
+    <w:p>
+      <w:pPr>
+        <w:spacing w:after="120" w:before="80"/>
+      </w:pPr>
+      <w:r>
+        <w:rPr>
+          <w:b/>
+          <w:bCs/>
+          <w:color w:val="041E42"/>
+          <w:sz w:val="22"/>
+          <w:szCs w:val="22"/>
+        </w:rPr>
+        <w:t xml:space="preserve">What I need: </w:t>
+      </w:r>
+      <w:r>
+        <w:rPr>
+          <w:color w:val="97999B"/>
+          <w:sz w:val="22"/>
+          <w:szCs w:val="22"/>
+        </w:rPr>
+        <w:t xml:space="preserve">________________________________________</w:t>
+      </w:r>
+    </w:p>
+    <w:p>
+      <w:pPr>
+        <w:spacing w:after="10" w:before="100"/>
+      </w:pPr>
+      <w:r>
+        <w:rPr>
+          <w:b/>
+          <w:bCs/>
+          <w:color w:val="004976"/>
+          <w:sz w:val="20"/>
+          <w:szCs w:val="20"/>
+        </w:rPr>
+        <w:t xml:space="preserve">Step 2 (next)</w:t>
+      </w:r>
+    </w:p>
     <w:tbl>
       <w:tblPr>
         <w:tblW w:type="pct" w:w="100%"/>
@@ -1562,7 +1638,7 @@
       </w:tblGrid>
       <w:tr>
         <w:trPr>
-          <w:trHeight w:val="1100" w:hRule="atLeast"/>
+          <w:trHeight w:val="620" w:hRule="atLeast"/>
         </w:trPr>
         <w:tc>
           <w:tcPr>
@@ -1582,12 +1658,50 @@
                 <w:sz w:val="18"/>
                 <w:szCs w:val="18"/>
               </w:rPr>
-              <w:t xml:space="preserve">step 2 — next</w:t>
+              <w:t xml:space="preserve">draw or write this step</w:t>
             </w:r>
           </w:p>
         </w:tc>
       </w:tr>
     </w:tbl>
+    <w:p>
+      <w:pPr>
+        <w:spacing w:after="120" w:before="80"/>
+      </w:pPr>
+      <w:r>
+        <w:rPr>
+          <w:b/>
+          <w:bCs/>
+          <w:color w:val="041E42"/>
+          <w:sz w:val="22"/>
+          <w:szCs w:val="22"/>
+        </w:rPr>
+        <w:t xml:space="preserve">What I need: </w:t>
+      </w:r>
+      <w:r>
+        <w:rPr>
+          <w:color w:val="97999B"/>
+          <w:sz w:val="22"/>
+          <w:szCs w:val="22"/>
+        </w:rPr>
+        <w:t xml:space="preserve">________________________________________</w:t>
+      </w:r>
+    </w:p>
+    <w:p>
+      <w:pPr>
+        <w:spacing w:after="10" w:before="100"/>
+      </w:pPr>
+      <w:r>
+        <w:rPr>
+          <w:b/>
+          <w:bCs/>
+          <w:color w:val="004976"/>
+          <w:sz w:val="20"/>
+          <w:szCs w:val="20"/>
+        </w:rPr>
+        <w:t xml:space="preserve">Step 3 (then)</w:t>
+      </w:r>
+    </w:p>
     <w:tbl>
       <w:tblPr>
         <w:tblW w:type="pct" w:w="100%"/>
@@ -1605,7 +1719,7 @@
       </w:tblGrid>
       <w:tr>
         <w:trPr>
-          <w:trHeight w:val="1100" w:hRule="atLeast"/>
+          <w:trHeight w:val="620" w:hRule="atLeast"/>
         </w:trPr>
         <w:tc>
           <w:tcPr>
@@ -1625,12 +1739,73 @@
                 <w:sz w:val="18"/>
                 <w:szCs w:val="18"/>
               </w:rPr>
-              <w:t xml:space="preserve">step 3 — then</w:t>
+              <w:t xml:space="preserve">draw or write this step</w:t>
             </w:r>
           </w:p>
         </w:tc>
       </w:tr>
     </w:tbl>
+    <w:p>
+      <w:pPr>
+        <w:spacing w:after="120" w:before="80"/>
+      </w:pPr>
+      <w:r>
+        <w:rPr>
+          <w:b/>
+          <w:bCs/>
+          <w:color w:val="041E42"/>
+          <w:sz w:val="22"/>
+          <w:szCs w:val="22"/>
+        </w:rPr>
+        <w:t xml:space="preserve">What I need: </w:t>
+      </w:r>
+      <w:r>
+        <w:rPr>
+          <w:color w:val="97999B"/>
+          <w:sz w:val="22"/>
+          <w:szCs w:val="22"/>
+        </w:rPr>
+        <w:t xml:space="preserve">________________________________________</w:t>
+      </w:r>
+    </w:p>
+    <w:p>
+      <w:pPr>
+        <w:spacing w:before="130"/>
+      </w:pPr>
+      <w:r>
+        <w:rPr>
+          <w:b/>
+          <w:bCs/>
+          <w:color w:val="3F8291"/>
+          <w:sz w:val="20"/>
+          <w:szCs w:val="20"/>
+        </w:rPr>
+        <w:t xml:space="preserve">My first step this week:  </w:t>
+      </w:r>
+      <w:r>
+        <w:rPr>
+          <w:color w:val="97999B"/>
+          <w:sz w:val="20"/>
+          <w:szCs w:val="20"/>
+        </w:rPr>
+        <w:t xml:space="preserve">________________</w:t>
+      </w:r>
+    </w:p>
+    <w:p>
+      <w:pPr>
+        <w:spacing w:before="120"/>
+      </w:pPr>
+      <w:r>
+        <w:rPr>
+          <w:i/>
+          <w:iCs/>
+          <w:color w:val="6B7280"/>
+          <w:sz w:val="17"/>
+          <w:szCs w:val="17"/>
+        </w:rPr>
+        <w:t xml:space="preserve">There is an Action Plan sheet you can use again for other goals.</w:t>
+      </w:r>
+    </w:p>
     <w:p>
       <w:r>
         <w:br w:type="page"/>

</xml_diff>